<commit_message>
Document the rename and the customer-facing label
Co-authored-by: paladuguraj <paladuguraj@users.noreply.github.com>
</commit_message>
<xml_diff>
--- a/docs/CSAT Survey Portal - Email Template Plan of Action.docx
+++ b/docs/CSAT Survey Portal - Email Template Plan of Action.docx
@@ -3996,7 +3996,7 @@
               <w:jc w:val="left"/>
             </w:pPr>
             <w:r>
-              <w:t xml:space="preserve">Complex Resolution Survey</w:t>
+              <w:t xml:space="preserve">Managed Network Services Survey - Manual</w:t>
             </w:r>
           </w:p>
         </w:tc>
@@ -4026,7 +4026,7 @@
               <w:jc w:val="left"/>
             </w:pPr>
             <w:r>
-              <w:t xml:space="preserve">Generic Schedule Survey</w:t>
+              <w:t xml:space="preserve">Managed Network Services Survey - Automatic</w:t>
             </w:r>
           </w:p>
         </w:tc>

</xml_diff>